<commit_message>
TP1 UCA : un dossier de code par étape du TP + README d'index
Co-Authored-By: Claude Opus 5.5 <noreply@anthropic.com>
Claude-Session: https://claude.ai/code/session_014t3G8CKAJXNUk2xdECRj7i
</commit_message>
<xml_diff>
--- a/TP1_UCA/rapport/Compte_rendu_TP1_UCA.docx
+++ b/TP1_UCA/rapport/Compte_rendu_TP1_UCA.docx
@@ -24906,7 +24906,7 @@
               <w:jc w:val="left"/>
             </w:pPr>
             <w:r>
-              <w:t xml:space="preserve">Blink</w:t>
+              <w:t xml:space="preserve">Etape_1_6_Blink</w:t>
             </w:r>
           </w:p>
         </w:tc>
@@ -24944,7 +24944,7 @@
               <w:jc w:val="left"/>
             </w:pPr>
             <w:r>
-              <w:t xml:space="preserve">Blink_Millis</w:t>
+              <w:t xml:space="preserve">Etape_3_1_Millis</w:t>
             </w:r>
           </w:p>
         </w:tc>
@@ -24982,7 +24982,7 @@
               <w:jc w:val="left"/>
             </w:pPr>
             <w:r>
-              <w:t xml:space="preserve">Blink_Mod</w:t>
+              <w:t xml:space="preserve">Etape_2_1_Sortie_Serie_Blink_Mod</w:t>
             </w:r>
           </w:p>
         </w:tc>
@@ -25020,7 +25020,7 @@
               <w:jc w:val="left"/>
             </w:pPr>
             <w:r>
-              <w:t xml:space="preserve">Blink_SerialInput</w:t>
+              <w:t xml:space="preserve">Etape_2_2_Entree_Serie_1_chiffre</w:t>
             </w:r>
           </w:p>
         </w:tc>
@@ -25058,7 +25058,7 @@
               <w:jc w:val="left"/>
             </w:pPr>
             <w:r>
-              <w:t xml:space="preserve">Blink_SerialNumber</w:t>
+              <w:t xml:space="preserve">Etape_2_2_Entree_Serie_plusieurs_chiffres</w:t>
             </w:r>
           </w:p>
         </w:tc>
@@ -25096,7 +25096,7 @@
               <w:jc w:val="left"/>
             </w:pPr>
             <w:r>
-              <w:t xml:space="preserve">Exo1_SeuilLuminosite</w:t>
+              <w:t xml:space="preserve">Partie_5_I_1_Seuil_Luminosite</w:t>
             </w:r>
           </w:p>
         </w:tc>
@@ -25134,7 +25134,7 @@
               <w:jc w:val="left"/>
             </w:pPr>
             <w:r>
-              <w:t xml:space="preserve">Exo2_Inclinaison</w:t>
+              <w:t xml:space="preserve">Partie_5_I_2_Detection_Inclinaison</w:t>
             </w:r>
           </w:p>
         </w:tc>
@@ -25172,7 +25172,7 @@
               <w:jc w:val="left"/>
             </w:pPr>
             <w:r>
-              <w:t xml:space="preserve">Exo3_StationMeteo</w:t>
+              <w:t xml:space="preserve">Partie_5_II_1_Station_Meteo</w:t>
             </w:r>
           </w:p>
         </w:tc>
@@ -25210,7 +25210,7 @@
               <w:jc w:val="left"/>
             </w:pPr>
             <w:r>
-              <w:t xml:space="preserve">Exo4_AlerteIoT</w:t>
+              <w:t xml:space="preserve">Partie_5_II_2_Alerte_IoT</w:t>
             </w:r>
           </w:p>
         </w:tc>
@@ -25248,7 +25248,7 @@
               <w:jc w:val="left"/>
             </w:pPr>
             <w:r>
-              <w:t xml:space="preserve">Exo5_ClignotementAccel</w:t>
+              <w:t xml:space="preserve">Partie_5_II_3_Clignotement_Accelerometre</w:t>
             </w:r>
           </w:p>
         </w:tc>
@@ -25286,7 +25286,7 @@
               <w:jc w:val="left"/>
             </w:pPr>
             <w:r>
-              <w:t xml:space="preserve">UCA_Board_KXTJ3</w:t>
+              <w:t xml:space="preserve">Etape_4_4_UCA_Board_KXTJ3</w:t>
             </w:r>
           </w:p>
         </w:tc>
@@ -25324,7 +25324,7 @@
               <w:jc w:val="left"/>
             </w:pPr>
             <w:r>
-              <w:t xml:space="preserve">UCA_Board_LTR303</w:t>
+              <w:t xml:space="preserve">Etape_4_3_UCA_Board_LTR303</w:t>
             </w:r>
           </w:p>
         </w:tc>
@@ -25362,7 +25362,7 @@
               <w:jc w:val="left"/>
             </w:pPr>
             <w:r>
-              <w:t xml:space="preserve">UCA_Board_RGBLED</w:t>
+              <w:t xml:space="preserve">Etape_4_5_UCA_Board_RGBLED</w:t>
             </w:r>
           </w:p>
         </w:tc>
@@ -25400,7 +25400,7 @@
               <w:jc w:val="left"/>
             </w:pPr>
             <w:r>
-              <w:t xml:space="preserve">UCA_Board_SHTC3</w:t>
+              <w:t xml:space="preserve">Etape_4_2_UCA_Board_SHTC3</w:t>
             </w:r>
           </w:p>
         </w:tc>

</xml_diff>